<commit_message>
Tive Account Manager: logistics angle corrected to Wix third-party shipping setup; profile corrected
Co-Authored-By: Claude Opus 5.5 <noreply@anthropic.com>
Claude-Session: https://claude.ai/code/session_01HUxzaee8VTv7sJJkCcz6f3
</commit_message>
<xml_diff>
--- a/applications/tive-account-manager/Tive-AccountManager-Resume.docx
+++ b/applications/tive-account-manager/Tive-AccountManager-Resume.docx
@@ -753,6 +753,30 @@
           <w:i w:val="0"/>
           <w:color w:val="1A1A1A"/>
         </w:rPr>
+        <w:t>Set up third-party shipping integrations for e-commerce clients launching online storefronts alongside their physical retail locations.</w:t>
+      </w:r>
+    </w:p>
+    <w:p>
+      <w:pPr>
+        <w:spacing w:after="30"/>
+        <w:ind w:left="259" w:hanging="259"/>
+      </w:pPr>
+      <w:r>
+        <w:rPr>
+          <w:rFonts w:ascii="Calibri" w:hAnsi="Calibri"/>
+          <w:b w:val="0"/>
+          <w:i w:val="0"/>
+          <w:color w:val="163A5F"/>
+        </w:rPr>
+        <w:t xml:space="preserve">•  </w:t>
+      </w:r>
+      <w:r>
+        <w:rPr>
+          <w:rFonts w:ascii="Calibri" w:hAnsi="Calibri"/>
+          <w:b w:val="0"/>
+          <w:i w:val="0"/>
+          <w:color w:val="1A1A1A"/>
+        </w:rPr>
         <w:t>Managed a high-value account portfolio, contributing to a 30% increase in website traffic and 25% improvement in conversion rates across the e-commerce segment.</w:t>
       </w:r>
     </w:p>

</xml_diff>